<commit_message>
Refonte du design de l'intranet et ajout du bandeau d'annonces
Redesign complet des 4 pages d'après la maquette Claude Design (thème
doré/crème, polices Spectral + Public Sans, feuille de style unique
assets/css/style.css). Fusion des 6 pages mail-rappel-*.html en un seul
gabarit mail-rappel.html piloté par ?n= et un bloc de données éditable.

Ajouts : favicon, bandeau d'annonces (info/panne) piloté par
assets/js/announcements.js, pied de page ancré en bas d'écran.

Nettoyage : suppression de 2 PDF obsolètes dans docs/ et du logo dupliqué
à la racine (déplacé dans assets/).

Co-Authored-By: Claude Opus 5 <noreply@anthropic.com>
</commit_message>
<xml_diff>
--- a/docs/Montmagny_Formulaire de Demande d'Accès.docx
+++ b/docs/Montmagny_Formulaire de Demande d'Accès.docx
@@ -38,34 +38,7 @@
           <w:sz w:val="52"/>
           <w:szCs w:val="52"/>
         </w:rPr>
-        <w:t>D</w:t>
-      </w:r>
-      <w:r>
-        <w:rPr>
-          <w:rFonts w:asciiTheme="minorHAnsi" w:hAnsiTheme="minorHAnsi" w:cstheme="minorHAnsi"/>
-          <w:b/>
-          <w:sz w:val="52"/>
-          <w:szCs w:val="52"/>
-        </w:rPr>
-        <w:t>emande</w:t>
-      </w:r>
-      <w:r>
-        <w:rPr>
-          <w:rFonts w:asciiTheme="minorHAnsi" w:hAnsiTheme="minorHAnsi" w:cstheme="minorHAnsi"/>
-          <w:b/>
-          <w:sz w:val="52"/>
-          <w:szCs w:val="52"/>
-        </w:rPr>
-        <w:t xml:space="preserve"> </w:t>
-      </w:r>
-      <w:r>
-        <w:rPr>
-          <w:rFonts w:asciiTheme="minorHAnsi" w:hAnsiTheme="minorHAnsi" w:cstheme="minorHAnsi"/>
-          <w:b/>
-          <w:sz w:val="52"/>
-          <w:szCs w:val="52"/>
-        </w:rPr>
-        <w:t>Matériel</w:t>
+        <w:t>création de compte</w:t>
       </w:r>
     </w:p>
     <w:p>
@@ -1134,9 +1107,6 @@
                                   <w:iCs/>
                                 </w:rPr>
                                 <w:id w:val="1067462355"/>
-                                <w:placeholder>
-                                  <w:docPart w:val="608AAF7732EC4624A9BBFCCCF85FEC55"/>
-                                </w:placeholder>
                                 <w:text/>
                               </w:sdtPr>
                               <w:sdtContent>
@@ -1144,13 +1114,7 @@
                                   <w:rPr>
                                     <w:color w:val="909090"/>
                                   </w:rPr>
-                                  <w:t>A</w:t>
-                                </w:r>
-                                <w:r>
-                                  <w:rPr>
-                                    <w:color w:val="909090"/>
-                                  </w:rPr>
-                                  <w:t xml:space="preserve"> préciser...</w:t>
+                                  <w:t>A préciser...</w:t>
                                 </w:r>
                               </w:sdtContent>
                             </w:sdt>
@@ -1213,9 +1177,6 @@
                                 <w:rFonts w:asciiTheme="minorHAnsi" w:hAnsiTheme="minorHAnsi" w:cstheme="minorHAnsi"/>
                               </w:rPr>
                               <w:id w:val="-758440677"/>
-                              <w:placeholder>
-                                <w:docPart w:val="20DBB4D721FF49C2ACA104B4894A602A"/>
-                              </w:placeholder>
                               <w:showingPlcHdr/>
                               <w:text/>
                             </w:sdtPr>
@@ -1270,9 +1231,6 @@
                                   <w:color w:val="909090"/>
                                 </w:rPr>
                                 <w:id w:val="1018350280"/>
-                                <w:placeholder>
-                                  <w:docPart w:val="DefaultPlaceholder_-1854013440"/>
-                                </w:placeholder>
                                 <w:text/>
                               </w:sdtPr>
                               <w:sdtContent>
@@ -1284,11 +1242,6 @@
                                 </w:r>
                               </w:sdtContent>
                             </w:sdt>
-                            <w:r>
-                              <w:rPr>
-                                <w:rFonts w:asciiTheme="minorHAnsi" w:hAnsiTheme="minorHAnsi" w:cstheme="minorHAnsi"/>
-                              </w:rPr>
-                            </w:r>
                           </w:p>
                           <w:p>
                             <w:pPr>
@@ -2112,9 +2065,6 @@
                                   <w:rFonts w:asciiTheme="minorHAnsi" w:hAnsiTheme="minorHAnsi" w:cstheme="minorHAnsi"/>
                                 </w:rPr>
                                 <w:id w:val="-952705983"/>
-                                <w:placeholder>
-                                  <w:docPart w:val="6B9F7FCBA1024043AA974A8636B1FC85"/>
-                                </w:placeholder>
                                 <w:showingPlcHdr/>
                                 <w:text/>
                               </w:sdtPr>
@@ -3511,6 +3461,7 @@
   <w:style w:type="character" w:default="1" w:styleId="Policepardfaut">
     <w:name w:val="Default Paragraph Font"/>
     <w:uiPriority w:val="1"/>
+    <w:semiHidden/>
     <w:unhideWhenUsed/>
   </w:style>
   <w:style w:type="table" w:default="1" w:styleId="TableauNormal">
@@ -3735,12 +3686,14 @@
     <w:rsid w:val="00380F90"/>
     <w:rsid w:val="003B603D"/>
     <w:rsid w:val="003D55DD"/>
+    <w:rsid w:val="00421714"/>
     <w:rsid w:val="0044748E"/>
     <w:rsid w:val="007664E7"/>
     <w:rsid w:val="009B1B75"/>
     <w:rsid w:val="00A35E02"/>
     <w:rsid w:val="00D127B1"/>
     <w:rsid w:val="00D17F9A"/>
+    <w:rsid w:val="00EE7B59"/>
     <w:rsid w:val="00F27A60"/>
     <w:rsid w:val="00F60F98"/>
     <w:rsid w:val="00FA15C6"/>
@@ -4202,57 +4155,8 @@
       <w:color w:val="808080"/>
     </w:rPr>
   </w:style>
-  <w:style w:type="paragraph" w:customStyle="1" w:styleId="F96799DAE4F94381883E085B7B1CA4681">
-    <w:name w:val="F96799DAE4F94381883E085B7B1CA4681"/>
-    <w:rsid w:val="003B603D"/>
-    <w:pPr>
-      <w:spacing w:after="0" w:line="240" w:lineRule="auto"/>
-    </w:pPr>
-    <w:rPr>
-      <w:rFonts w:ascii="Times New Roman" w:eastAsia="Times New Roman" w:hAnsi="Times New Roman" w:cs="Times New Roman"/>
-      <w:sz w:val="24"/>
-      <w:szCs w:val="24"/>
-    </w:rPr>
-  </w:style>
-  <w:style w:type="paragraph" w:customStyle="1" w:styleId="608AAF7732EC4624A9BBFCCCF85FEC55">
-    <w:name w:val="608AAF7732EC4624A9BBFCCCF85FEC55"/>
-    <w:rsid w:val="00A35E02"/>
-    <w:pPr>
-      <w:spacing w:line="278" w:lineRule="auto"/>
-    </w:pPr>
-    <w:rPr>
-      <w:kern w:val="2"/>
-      <w:sz w:val="24"/>
-      <w:szCs w:val="24"/>
-      <w14:ligatures w14:val="standardContextual"/>
-    </w:rPr>
-  </w:style>
   <w:style w:type="paragraph" w:customStyle="1" w:styleId="F96799DAE4F94381883E085B7B1CA468">
     <w:name w:val="F96799DAE4F94381883E085B7B1CA468"/>
-    <w:rsid w:val="00A35E02"/>
-    <w:pPr>
-      <w:spacing w:after="0" w:line="240" w:lineRule="auto"/>
-    </w:pPr>
-    <w:rPr>
-      <w:rFonts w:ascii="Times New Roman" w:eastAsia="Times New Roman" w:hAnsi="Times New Roman" w:cs="Times New Roman"/>
-      <w:sz w:val="24"/>
-      <w:szCs w:val="24"/>
-    </w:rPr>
-  </w:style>
-  <w:style w:type="paragraph" w:customStyle="1" w:styleId="20DBB4D721FF49C2ACA104B4894A602A">
-    <w:name w:val="20DBB4D721FF49C2ACA104B4894A602A"/>
-    <w:rsid w:val="00A35E02"/>
-    <w:pPr>
-      <w:spacing w:after="0" w:line="240" w:lineRule="auto"/>
-    </w:pPr>
-    <w:rPr>
-      <w:rFonts w:ascii="Times New Roman" w:eastAsia="Times New Roman" w:hAnsi="Times New Roman" w:cs="Times New Roman"/>
-      <w:sz w:val="24"/>
-      <w:szCs w:val="24"/>
-    </w:rPr>
-  </w:style>
-  <w:style w:type="paragraph" w:customStyle="1" w:styleId="6B9F7FCBA1024043AA974A8636B1FC85">
-    <w:name w:val="6B9F7FCBA1024043AA974A8636B1FC85"/>
     <w:rsid w:val="00A35E02"/>
     <w:pPr>
       <w:spacing w:after="0" w:line="240" w:lineRule="auto"/>

</xml_diff>